<commit_message>
Add charts to Share section and embed PNGs in Word document
Ran full ML pipeline (RF + SMOTE), saved 4 matplotlib figures as PNG,
and embedded them directly into the Share section of
Hospital_Readmission_Prediction_20260621_v1.docx. Accuracy: 75.7%.

Co-Authored-By: Claude Sonnet 4.6 <noreply@anthropic.com>
</commit_message>
<xml_diff>
--- a/output/Hospital_Readmission_Prediction_20260621_v1.docx
+++ b/output/Hospital_Readmission_Prediction_20260621_v1.docx
@@ -275,7 +275,7 @@
     <w:p>
       <w:pPr/>
       <w:r>
-        <w:t>Next, the Random Forest Classifier was trained on the SMOTE-resampled training set and evaluated on the original, unseen 20% test set. The model achieved an overall accuracy in the 62–65% range. The classification report revealed higher precision and recall for the majority class (no early readmission) than for the minority class (early readmission), reflecting the structural difficulty of detecting rare clinical events even after balancing. The confusion matrix made this trade-off explicit: while the model correctly identifies a substantial proportion of true negatives, false negatives (high-risk patients missed by the model) remain the primary area for improvement from a clinical safety perspective.</w:t>
+        <w:t>Next, the Random Forest Classifier was trained on the SMOTE-resampled training set and evaluated on the original, unseen 20% test set. The model achieved an overall accuracy of 75.7%. The classification report revealed higher precision and recall for the majority class (no early readmission) than for the minority class (early readmission), reflecting the structural difficulty of detecting rare clinical events even after balancing. The confusion matrix made this trade-off explicit: while the model correctly identifies a substantial proportion of true negatives, false negatives (high-risk patients missed by the model) remain the primary area for improvement from a clinical safety perspective.</w:t>
       </w:r>
     </w:p>
     <w:p>
@@ -284,7 +284,7 @@
     <w:p>
       <w:pPr/>
       <w:r>
-        <w:t>Feature importance rankings were then extracted from the fitted Random Forest to identify the variables most predictive of early readmission. The top contributing features were time_in_hospital, num_lab_procedures, num_medications, and number_diagnoses — all reflecting the severity and clinical complexity of the patient's episode. Demographic variables such as age and race contributed moderately, while diagnosis codes (diag_1, diag_2, diag_3) also surfaced as relevant predictors, particularly for patients with primary diabetic complications.</w:t>
+        <w:t>Feature importance rankings were then extracted from the fitted Random Forest to identify the variables most predictive of early readmission. The top contributing features were gender, change, insulin, and diag_1 — all reflecting the severity and clinical complexity of the patient's episode. Demographic variables such as age and race contributed moderately, while diagnosis codes (diag_1, diag_2, diag_3) also surfaced as relevant predictors, particularly for patients with primary diabetic complications.</w:t>
       </w:r>
     </w:p>
     <w:p>
@@ -335,8 +335,47 @@
       </w:r>
     </w:p>
     <w:p>
+      <w:r>
+        <w:drawing>
+          <wp:inline xmlns:a="http://schemas.openxmlformats.org/drawingml/2006/main" xmlns:pic="http://schemas.openxmlformats.org/drawingml/2006/picture">
+            <wp:extent cx="5029200" cy="4191000"/>
+            <wp:docPr id="1" name="Picture 1"/>
+            <wp:cNvGraphicFramePr>
+              <a:graphicFrameLocks noChangeAspect="1"/>
+            </wp:cNvGraphicFramePr>
+            <a:graphic>
+              <a:graphicData uri="http://schemas.openxmlformats.org/drawingml/2006/picture">
+                <pic:pic>
+                  <pic:nvPicPr>
+                    <pic:cNvPr id="0" name="fig1_confusion_matrix.png"/>
+                    <pic:cNvPicPr/>
+                  </pic:nvPicPr>
+                  <pic:blipFill>
+                    <a:blip r:embed="rId9"/>
+                    <a:stretch>
+                      <a:fillRect/>
+                    </a:stretch>
+                  </pic:blipFill>
+                  <pic:spPr>
+                    <a:xfrm>
+                      <a:off x="0" y="0"/>
+                      <a:ext cx="5029200" cy="4191000"/>
+                    </a:xfrm>
+                    <a:prstGeom prst="rect"/>
+                  </pic:spPr>
+                </pic:pic>
+              </a:graphicData>
+            </a:graphic>
+          </wp:inline>
+        </w:drawing>
+      </w:r>
+    </w:p>
+    <w:p>
       <w:pPr/>
       <w:r>
+        <w:rPr>
+          <w:i/>
+        </w:rPr>
         <w:t>Figure 1 – Confusion Matrix (Heatmap)</w:t>
       </w:r>
     </w:p>
@@ -356,8 +395,47 @@
       </w:r>
     </w:p>
     <w:p>
+      <w:r>
+        <w:drawing>
+          <wp:inline xmlns:a="http://schemas.openxmlformats.org/drawingml/2006/main" xmlns:pic="http://schemas.openxmlformats.org/drawingml/2006/picture">
+            <wp:extent cx="5029200" cy="7543800"/>
+            <wp:docPr id="2" name="Picture 2"/>
+            <wp:cNvGraphicFramePr>
+              <a:graphicFrameLocks noChangeAspect="1"/>
+            </wp:cNvGraphicFramePr>
+            <a:graphic>
+              <a:graphicData uri="http://schemas.openxmlformats.org/drawingml/2006/picture">
+                <pic:pic>
+                  <pic:nvPicPr>
+                    <pic:cNvPr id="0" name="fig2_feature_importance.png"/>
+                    <pic:cNvPicPr/>
+                  </pic:nvPicPr>
+                  <pic:blipFill>
+                    <a:blip r:embed="rId10"/>
+                    <a:stretch>
+                      <a:fillRect/>
+                    </a:stretch>
+                  </pic:blipFill>
+                  <pic:spPr>
+                    <a:xfrm>
+                      <a:off x="0" y="0"/>
+                      <a:ext cx="5029200" cy="7543800"/>
+                    </a:xfrm>
+                    <a:prstGeom prst="rect"/>
+                  </pic:spPr>
+                </pic:pic>
+              </a:graphicData>
+            </a:graphic>
+          </wp:inline>
+        </w:drawing>
+      </w:r>
+    </w:p>
+    <w:p>
       <w:pPr/>
       <w:r>
+        <w:rPr>
+          <w:i/>
+        </w:rPr>
         <w:t>Figure 2 – Feature Importance (Bar Chart)</w:t>
       </w:r>
     </w:p>
@@ -377,8 +455,47 @@
       </w:r>
     </w:p>
     <w:p>
+      <w:r>
+        <w:drawing>
+          <wp:inline xmlns:a="http://schemas.openxmlformats.org/drawingml/2006/main" xmlns:pic="http://schemas.openxmlformats.org/drawingml/2006/picture">
+            <wp:extent cx="5029200" cy="3592286"/>
+            <wp:docPr id="3" name="Picture 3"/>
+            <wp:cNvGraphicFramePr>
+              <a:graphicFrameLocks noChangeAspect="1"/>
+            </wp:cNvGraphicFramePr>
+            <a:graphic>
+              <a:graphicData uri="http://schemas.openxmlformats.org/drawingml/2006/picture">
+                <pic:pic>
+                  <pic:nvPicPr>
+                    <pic:cNvPr id="0" name="fig3_count_by_gender.png"/>
+                    <pic:cNvPicPr/>
+                  </pic:nvPicPr>
+                  <pic:blipFill>
+                    <a:blip r:embed="rId11"/>
+                    <a:stretch>
+                      <a:fillRect/>
+                    </a:stretch>
+                  </pic:blipFill>
+                  <pic:spPr>
+                    <a:xfrm>
+                      <a:off x="0" y="0"/>
+                      <a:ext cx="5029200" cy="3592286"/>
+                    </a:xfrm>
+                    <a:prstGeom prst="rect"/>
+                  </pic:spPr>
+                </pic:pic>
+              </a:graphicData>
+            </a:graphic>
+          </wp:inline>
+        </w:drawing>
+      </w:r>
+    </w:p>
+    <w:p>
       <w:pPr/>
       <w:r>
+        <w:rPr>
+          <w:i/>
+        </w:rPr>
         <w:t>Figure 3 – Count Readmitted by Gender (Count Plot)</w:t>
       </w:r>
     </w:p>
@@ -398,8 +515,47 @@
       </w:r>
     </w:p>
     <w:p>
+      <w:r>
+        <w:drawing>
+          <wp:inline xmlns:a="http://schemas.openxmlformats.org/drawingml/2006/main" xmlns:pic="http://schemas.openxmlformats.org/drawingml/2006/picture">
+            <wp:extent cx="5029200" cy="3592286"/>
+            <wp:docPr id="4" name="Picture 4"/>
+            <wp:cNvGraphicFramePr>
+              <a:graphicFrameLocks noChangeAspect="1"/>
+            </wp:cNvGraphicFramePr>
+            <a:graphic>
+              <a:graphicData uri="http://schemas.openxmlformats.org/drawingml/2006/picture">
+                <pic:pic>
+                  <pic:nvPicPr>
+                    <pic:cNvPr id="0" name="fig4_correlation_matrix.png"/>
+                    <pic:cNvPicPr/>
+                  </pic:nvPicPr>
+                  <pic:blipFill>
+                    <a:blip r:embed="rId12"/>
+                    <a:stretch>
+                      <a:fillRect/>
+                    </a:stretch>
+                  </pic:blipFill>
+                  <pic:spPr>
+                    <a:xfrm>
+                      <a:off x="0" y="0"/>
+                      <a:ext cx="5029200" cy="3592286"/>
+                    </a:xfrm>
+                    <a:prstGeom prst="rect"/>
+                  </pic:spPr>
+                </pic:pic>
+              </a:graphicData>
+            </a:graphic>
+          </wp:inline>
+        </w:drawing>
+      </w:r>
+    </w:p>
+    <w:p>
       <w:pPr/>
       <w:r>
+        <w:rPr>
+          <w:i/>
+        </w:rPr>
         <w:t>Figure 4 – Correlation Matrix (Heatmap)</w:t>
       </w:r>
     </w:p>

</xml_diff>

<commit_message>
Update Hospital Readmission Prediction report
Co-Authored-By: Claude Sonnet 4.6 <noreply@anthropic.com>
</commit_message>
<xml_diff>
--- a/output/Hospital_Readmission_Prediction_20260621_v1.docx
+++ b/output/Hospital_Readmission_Prediction_20260621_v1.docx
@@ -48,10 +48,15 @@
         <w:t>•  How accurately can a machine learning model predict early readmission from structured patient data?</w:t>
       </w:r>
     </w:p>
-    <w:p/>
     <w:p>
       <w:r>
-        <w:t>Objective: Identify high-risk diabetic patients and the clinical features most predictive of early hospital readmission (&lt;30 days), to support data-driven decisions on discharge planning, care coordination, resource allocation, and targeted intervention programmes.</w:t>
+        <w:t>Objective: Identify high-risk diabetic patients and the clinical features most predictive of early hospital readmission (&lt;30 days), to support data-driven decisions on discharge planning, care coordination, resource allocation, and targeted intervention program</w:t>
+      </w:r>
+      <w:r>
+        <w:t>s</w:t>
+      </w:r>
+      <w:r>
+        <w:t>.</w:t>
       </w:r>
     </w:p>
     <w:p>
@@ -86,7 +91,13 @@
         <w:ind w:left="360"/>
       </w:pPr>
       <w:r>
-        <w:t>•  Columns (25+): encounter_id, patient_nbr, race, gender, age, weight, admission_type_id, discharge_disposition_id, admission_source_id, time_in_hospital, payer_code, medical_specialty, num_lab_procedures, num_procedures, num_medications, number_outpatient, number_emergency, number_inpatient, diag_1, diag_2, diag_3, number_diagnoses, max_glu_serum, A1Cresult, medication columns (metformin, insulin, etc.), change, diabetesMed, readmitted</w:t>
+        <w:t xml:space="preserve">•  Columns (25+): </w:t>
+      </w:r>
+      <w:r>
+        <w:t>encounter</w:t>
+      </w:r>
+      <w:r>
+        <w:t>, patient_nbr, race, gender, age, weight, admission_type_id, discharge_disposition_id, admission_source_id, time_in_hospital, payer_code, medical_specialty, num_lab_procedures, num_procedures, num_medications, number_outpatient, number_emergency, number_inpatient, diag_1, diag_2, diag_3, number_diagnoses, max_glu_serum, A1Cresult, medication columns (metformin, insulin, etc.), change, diabetesMed, readmitted</w:t>
       </w:r>
     </w:p>
     <w:p>
@@ -123,7 +134,13 @@
     <w:p/>
     <w:p>
       <w:r>
-        <w:t>Data integrity was verified using df.info() and df.describe(). Rows with missing readmitted values were dropped. Categorical columns were filled with 'Unknown' prior to encoding to handle sparse or unlabelled fields consistently.</w:t>
+        <w:t xml:space="preserve">Data integrity was verified using df.info() and df.describe(). Rows with missing readmitted values were dropped. Categorical columns were filled with 'Unknown' prior to encoding to handle sparse or </w:t>
+      </w:r>
+      <w:r>
+        <w:t>unlabeled</w:t>
+      </w:r>
+      <w:r>
+        <w:t xml:space="preserve"> fields consistently.</w:t>
       </w:r>
     </w:p>
     <w:p>
@@ -139,7 +156,6 @@
         <w:t>Processing steps applied using Python (pandas, scikit-learn, imbalanced-learn):</w:t>
       </w:r>
     </w:p>
-    <w:p/>
     <w:p>
       <w:pPr>
         <w:ind w:left="360"/>
@@ -223,6 +239,7 @@
     <w:p/>
     <w:p>
       <w:r>
+        <w:lastRenderedPageBreak/>
         <w:t>Tools used: Python 3, pandas, matplotlib, seaborn, scikit-learn, imbalanced-learn (imblearn).</w:t>
       </w:r>
     </w:p>
@@ -231,45 +248,55 @@
         <w:pStyle w:val="Heading1"/>
       </w:pPr>
       <w:r>
-        <w:t>4. Analyse</w:t>
+        <w:t xml:space="preserve">4. </w:t>
+      </w:r>
+      <w:r>
+        <w:t>Analyze</w:t>
       </w:r>
     </w:p>
     <w:p>
       <w:r>
-        <w:t>During the analyse phase, several computations and aggregations were performed to evaluate model performance and understand which clinical factors drive early readmission among diabetic patients.</w:t>
+        <w:t xml:space="preserve">During the </w:t>
+      </w:r>
+      <w:r>
+        <w:t>analyze</w:t>
+      </w:r>
+      <w:r>
+        <w:t xml:space="preserve"> phase, several computations and aggregations were performed to evaluate model performance and understand which clinical factors drive early readmission among diabetic patients.</w:t>
+      </w:r>
+    </w:p>
+    <w:p>
+      <w:r>
+        <w:t xml:space="preserve">First, descriptive exploration was carried out to </w:t>
+      </w:r>
+      <w:r>
+        <w:t>characterize</w:t>
+      </w:r>
+      <w:r>
+        <w:t xml:space="preserve"> the target distribution. Approximately 88% of encounters were labelled as not readmitted within 30 days (class 0), while around 12% were labelled as early readmissions (class 1). This pronounced class imbalance — roughly 7:1 — confirmed the need for SMOTE oversampling before model training; without it, a classifier could achieve high nominal accuracy simply by predicting the majority class for every observation.</w:t>
+      </w:r>
+    </w:p>
+    <w:p>
+      <w:r>
+        <w:t>Next, the Random Forest Classifier was trained on the SMOTE-resampled training set and evaluated on the original, unseen 20% test set. The model achieved an overall accuracy of 75.7%. The classification report revealed higher precision and recall for the majority class (no early readmission) than for the minority class (early readmission), reflecting the structural difficulty of detecting rare clinical events even after balancing. The confusion matrix made this trade-off explicit: while the model correctly identifies a substantial proportion of true negatives, false negatives (high-risk patients missed by the model) remain the primary area for improvement from a clinical safety perspective.</w:t>
       </w:r>
     </w:p>
     <w:p/>
     <w:p>
       <w:r>
-        <w:t>First, descriptive exploration was carried out to characterise the target distribution. Approximately 88% of encounters were labelled as not readmitted within 30 days (class 0), while around 12% were labelled as early readmissions (class 1). This pronounced class imbalance — roughly 7:1 — confirmed the need for SMOTE oversampling before model training; without it, a classifier could achieve high nominal accuracy simply by predicting the majority class for every observation.</w:t>
+        <w:t>Feature importance rankings were then extracted from the fitted Random Forest to identify the variables most predictive of early readmission. The top contributing features were gender, change, insulin, and diag_1 — all reflecting the severity and clinical complexity of the patient's episode. Demographic variables such as age and race contributed moderately, while diagnosis codes (diag_1, diag_2, diag_3) also surfaced as relevant predictors, particularly for patients with primary diabetic complications.</w:t>
       </w:r>
     </w:p>
     <w:p/>
     <w:p>
       <w:r>
-        <w:t>Next, the Random Forest Classifier was trained on the SMOTE-resampled training set and evaluated on the original, unseen 20% test set. The model achieved an overall accuracy of 75.7%. The classification report revealed higher precision and recall for the majority class (no early readmission) than for the minority class (early readmission), reflecting the structural difficulty of detecting rare clinical events even after balancing. The confusion matrix made this trade-off explicit: while the model correctly identifies a substantial proportion of true negatives, false negatives (high-risk patients missed by the model) remain the primary area for improvement from a clinical safety perspective.</w:t>
+        <w:t>Finally, a new patient prediction example was constructed to demonstrate the end-to-end pipeline from raw clinical input to a readmission probability score. For a 70–80-year-old Caucasian male with a 5-day hospital stay, 40 lab procedures, 10 medications, and primary diagnosis 250.83 (diabetic complication with renal manifestation), the model outputs a probability score for early readmission that can directly inform discharge decision-making at the bedside.</w:t>
       </w:r>
     </w:p>
     <w:p/>
     <w:p>
       <w:r>
-        <w:t>Feature importance rankings were then extracted from the fitted Random Forest to identify the variables most predictive of early readmission. The top contributing features were gender, change, insulin, and diag_1 — all reflecting the severity and clinical complexity of the patient's episode. Demographic variables such as age and race contributed moderately, while diagnosis codes (diag_1, diag_2, diag_3) also surfaced as relevant predictors, particularly for patients with primary diabetic complications.</w:t>
-      </w:r>
-    </w:p>
-    <w:p/>
-    <w:p>
-      <w:r>
-        <w:t xml:space="preserve">Finally, a new patient prediction example was constructed to demonstrate the end-to-end pipeline from raw clinical input to a readmission probability score. For a 70–80-year-old Caucasian male with a 5-day hospital stay, 40 lab procedures, 10 medications, and primary diagnosis 250.83 (diabetic complication with renal manifestation), the model outputs a </w:t>
-      </w:r>
-      <w:r>
         <w:lastRenderedPageBreak/>
-        <w:t>probability score for early readmission that can directly inform discharge decision-making at the bedside.</w:t>
-      </w:r>
-    </w:p>
-    <w:p/>
-    <w:p>
-      <w:r>
         <w:t>To communicate these findings to stakeholders, four visualizations were produced: a confusion matrix heatmap to evaluate prediction accuracy per class, a feature importance bar chart ranking the top clinical predictors, a count plot comparing readmission outcomes by gender, and a correlation heatmap highlighting linear relationships among all numerical features. These charts are presented in the Share section below.</w:t>
       </w:r>
     </w:p>
@@ -299,10 +326,6 @@
     </w:p>
     <w:p>
       <w:r>
-        <w:rPr>
-          <w:noProof/>
-        </w:rPr>
-        <w:lastRenderedPageBreak/>
         <w:drawing>
           <wp:inline distT="0" distB="0" distL="0" distR="0" wp14:anchorId="3290A981" wp14:editId="72C380BE">
             <wp:extent cx="5029200" cy="4191000"/>
@@ -351,19 +374,23 @@
     <w:p/>
     <w:p>
       <w:r>
+        <w:lastRenderedPageBreak/>
         <w:t>Figure 2 – Feature Importance (Bar Chart):</w:t>
       </w:r>
     </w:p>
     <w:p>
       <w:r>
-        <w:t>Ranks all input features by their contribution to the Random Forest model's predictions. Time in hospital, number of lab procedures, and number of medications emerge as the three strongest predictors of early readmission, guiding prioritisation of clinical risk factors.</w:t>
+        <w:t xml:space="preserve">Ranks all input features by their contribution to the Random Forest model's predictions. Time in hospital, number of lab procedures, and number of medications emerge as the three strongest predictors of early readmission, guiding </w:t>
+      </w:r>
+      <w:r>
+        <w:t>prioritization</w:t>
+      </w:r>
+      <w:r>
+        <w:t xml:space="preserve"> of clinical risk factors.</w:t>
       </w:r>
     </w:p>
     <w:p>
       <w:r>
-        <w:rPr>
-          <w:noProof/>
-        </w:rPr>
         <w:lastRenderedPageBreak/>
         <w:drawing>
           <wp:inline distT="0" distB="0" distL="0" distR="0" wp14:anchorId="512EF2C8" wp14:editId="1124C2F1">
@@ -424,9 +451,6 @@
     </w:p>
     <w:p>
       <w:r>
-        <w:rPr>
-          <w:noProof/>
-        </w:rPr>
         <w:drawing>
           <wp:inline distT="0" distB="0" distL="0" distR="0" wp14:anchorId="4A575AB0" wp14:editId="143EE230">
             <wp:extent cx="5029200" cy="3592286"/>
@@ -480,14 +504,14 @@
     </w:p>
     <w:p>
       <w:r>
-        <w:t>Visualises pairwise linear correlations among all numerical features in the dataset. Clusters of correlated predictors (e.g., procedure counts and medication volume) inform future feature selection and multicollinearity management.</w:t>
+        <w:t>Visualizes</w:t>
+      </w:r>
+      <w:r>
+        <w:t xml:space="preserve"> pairwise linear correlations among all numerical features in the dataset. Clusters of correlated predictors (e.g., procedure counts and medication volume) inform future feature selection and multicollinearity management.</w:t>
       </w:r>
     </w:p>
     <w:p>
       <w:r>
-        <w:rPr>
-          <w:noProof/>
-        </w:rPr>
         <w:lastRenderedPageBreak/>
         <w:drawing>
           <wp:inline distT="0" distB="0" distL="0" distR="0" wp14:anchorId="4B781385" wp14:editId="5891A51D">
@@ -552,7 +576,13 @@
         <w:ind w:left="360"/>
       </w:pPr>
       <w:r>
-        <w:t>1. Prioritise high-risk patients for enhanced discharge planning: patients with long hospital stays, high numbers of lab procedures, and multiple concurrent medications are the strongest indicators of early readmission. These patients should receive tailored discharge support, scheduled follow-up appointments, and community care referrals before leaving the hospital.</w:t>
+        <w:t xml:space="preserve">1. </w:t>
+      </w:r>
+      <w:r>
+        <w:t>Prioritize</w:t>
+      </w:r>
+      <w:r>
+        <w:t xml:space="preserve"> high-risk patients for enhanced discharge planning: patients with long hospital stays, high numbers of lab procedures, and multiple concurrent medications are the strongest indicators of early readmission. These patients should receive tailored discharge support, scheduled follow-up appointments, and community care referrals before leaving the hospital.</w:t>
       </w:r>
     </w:p>
     <w:p>
@@ -568,7 +598,13 @@
         <w:ind w:left="360"/>
       </w:pPr>
       <w:r>
-        <w:t>3. Reduce false negatives through threshold tuning and cost-sensitive learning: given the clinical cost of missing a high-risk patient (unplanned readmission, patient deterioration), adjust the classification threshold below 0.5 or apply class weights to penalise false negatives more heavily. Ensemble stacking or gradient-boosted models (XGBoost, LightGBM) may also improve minority-class recall.</w:t>
+        <w:t xml:space="preserve">3. Reduce false negatives through threshold tuning and cost-sensitive learning: given the clinical cost of missing a high-risk patient (unplanned readmission, patient deterioration), adjust the classification threshold below 0.5 or apply class weights to </w:t>
+      </w:r>
+      <w:r>
+        <w:t>penalize</w:t>
+      </w:r>
+      <w:r>
+        <w:t xml:space="preserve"> false negatives more heavily. Ensemble stacking or gradient-boosted models (XGBoost, LightGBM) may also improve minority-class recall.</w:t>
       </w:r>
     </w:p>
     <w:p>
@@ -576,7 +612,13 @@
         <w:ind w:left="360"/>
       </w:pPr>
       <w:r>
-        <w:t xml:space="preserve">4. Expand feature engineering: incorporate medication change patterns across the encounter, specialist involvement, payer type, and social determinants of health to </w:t>
+        <w:t xml:space="preserve">4. Expand feature engineering: incorporate medication </w:t>
+      </w:r>
+      <w:r>
+        <w:t>changes</w:t>
+      </w:r>
+      <w:r>
+        <w:t xml:space="preserve"> patterns across the encounter, specialist involvement, payer type, and social determinants of health to </w:t>
       </w:r>
       <w:r>
         <w:lastRenderedPageBreak/>
@@ -602,14 +644,8 @@
     <w:p>
       <w:pPr>
         <w:pStyle w:val="Heading1"/>
-        <w:rPr>
-          <w:lang w:val="fr-FR"/>
-        </w:rPr>
       </w:pPr>
       <w:r>
-        <w:rPr>
-          <w:lang w:val="fr-FR"/>
-        </w:rPr>
         <w:t>Appendix – Python Code (main.py)</w:t>
       </w:r>
     </w:p>
@@ -618,7 +654,6 @@
         <w:t>The following Python script was used to perform the data processing and generate the visualizations:</w:t>
       </w:r>
     </w:p>
-    <w:p/>
     <w:p>
       <w:r>
         <w:t>import pandas as pd</w:t>
@@ -720,15 +755,13 @@
       </w:r>
       <w:r>
         <w:br/>
+        <w:t>df_copy = df.copy()</w:t>
+      </w:r>
+      <w:r>
+        <w:br/>
       </w:r>
       <w:r>
         <w:lastRenderedPageBreak/>
-        <w:t>df_copy = df.copy()</w:t>
-      </w:r>
-      <w:r>
-        <w:br/>
-      </w:r>
-      <w:r>
         <w:br/>
         <w:t># -------------------------------</w:t>
       </w:r>
@@ -889,8 +922,10 @@
         <w:br/>
       </w:r>
       <w:r>
+        <w:br/>
+      </w:r>
+      <w:r>
         <w:lastRenderedPageBreak/>
-        <w:br/>
         <w:t>conf_matrix = confusion_matrix(y_test, y_pred)</w:t>
       </w:r>
       <w:r>
@@ -1054,13 +1089,13 @@
       </w:r>
       <w:r>
         <w:br/>
+        <w:t># Example patient record (fill in values as needed)</w:t>
+      </w:r>
+      <w:r>
+        <w:br/>
       </w:r>
       <w:r>
         <w:lastRenderedPageBreak/>
-        <w:t># Example patient record (fill in values as needed)</w:t>
-      </w:r>
-      <w:r>
-        <w:br/>
         <w:t>new_patients = pd.DataFrame([{</w:t>
       </w:r>
       <w:r>

</xml_diff>